<commit_message>
Refine ICON #075 resume project and education
</commit_message>
<xml_diff>
--- a/output/cv-alanis-sun-icon-clinical-trial-associate-study-start-up-support-jr161217-2026-09-30.docx
+++ b/output/cv-alanis-sun-icon-clinical-trial-associate-study-start-up-support-jr161217-2026-09-30.docx
@@ -403,6 +403,36 @@
     </ns0:p>
     <ns0:p>
       <ns0:pPr>
+        <ns0:spacing ns0:before="0" ns0:after="35" ns0:line="220" ns0:lineRule="auto"/>
+        <ns0:keepLines/>
+        <ns0:ind ns0:left="240" ns0:hanging="160"/>
+      </ns0:pPr>
+      <ns0:r>
+        <ns0:rPr>
+          <ns0:rFonts ns0:ascii="Arial" ns0:hAnsi="Arial"/>
+          <ns0:sz ns0:val="18"/>
+          <ns0:b/>
+        </ns0:rPr>
+        <ns0:t>• </ns0:t>
+      </ns0:r>
+      <ns0:r>
+        <ns0:rPr>
+          <ns0:b/>
+          <ns0:rFonts ns0:ascii="Arial" ns0:hAnsi="Arial"/>
+          <ns0:sz ns0:val="18"/>
+        </ns0:rPr>
+        <ns0:t xml:space="preserve">Clinical Trial REDCap Simulation:</ns0:t>
+      </ns0:r>
+      <ns0:r>
+        <ns0:rPr>
+          <ns0:rFonts ns0:ascii="Arial" ns0:hAnsi="Arial"/>
+          <ns0:sz ns0:val="18"/>
+        </ns0:rPr>
+        <ns0:t xml:space="preserve"> Designed a simulated Phase I EDC with longitudinal CRFs and visit mapping, sample traceability, data-quality controls, and role-based access concepts.</ns0:t>
+      </ns0:r>
+    </ns0:p>
+    <ns0:p>
+      <ns0:pPr>
         <ns0:spacing ns0:before="120" ns0:after="45" ns0:line="220" ns0:lineRule="auto"/>
         <ns0:keepLines/>
         <ns0:keepNext/>
@@ -443,7 +473,7 @@
           <ns0:rFonts ns0:ascii="Arial" ns0:hAnsi="Arial"/>
           <ns0:sz ns0:val="18"/>
         </ns0:rPr>
-        <ns0:t xml:space="preserve"> - Chang Gung University | 2017-2018; academic oncology/MDR research (not clinical-trial experience)</ns0:t>
+        <ns0:t xml:space="preserve"> - Chang Gung University | 2017-2018; academic oncology research involving multidrug resistance (MDR) and drug screening</ns0:t>
       </ns0:r>
     </ns0:p>
     <ns0:p>
@@ -611,27 +641,6 @@
           <ns0:sz ns0:val="18"/>
         </ns0:rPr>
         <ns0:t xml:space="preserve"> ClickUp, Smartsheet, Asana, Excel, GraphPad Prism, Benchling, SharePoint, Microsoft Teams, Notion, REDCap (independent simulation)</ns0:t>
-      </ns0:r>
-    </ns0:p>
-    <ns0:p>
-      <ns0:pPr>
-        <ns0:spacing ns0:before="0" ns0:after="35" ns0:line="220" ns0:lineRule="auto"/>
-        <ns0:keepLines/>
-      </ns0:pPr>
-      <ns0:r>
-        <ns0:rPr>
-          <ns0:b/>
-          <ns0:rFonts ns0:ascii="Arial" ns0:hAnsi="Arial"/>
-          <ns0:sz ns0:val="18"/>
-        </ns0:rPr>
-        <ns0:t xml:space="preserve">AI &amp; Productivity:</ns0:t>
-      </ns0:r>
-      <ns0:r>
-        <ns0:rPr>
-          <ns0:rFonts ns0:ascii="Arial" ns0:hAnsi="Arial"/>
-          <ns0:sz ns0:val="18"/>
-        </ns0:rPr>
-        <ns0:t xml:space="preserve"> ChatGPT, Codex, AI-assisted research synthesis, documentation, workflow organization</ns0:t>
       </ns0:r>
     </ns0:p>
     <ns0:p>

</xml_diff>